<commit_message>
agregacion del enunciado desarrollado por el grupo
</commit_message>
<xml_diff>
--- a/TPI entrega 1 .docx
+++ b/TPI entrega 1 .docx
@@ -1,6 +1,6 @@
 
 <file path=word/document.xml><?xml version="1.0" encoding="utf-8"?>
-<w:document xmlns:wpc="http://schemas.microsoft.com/office/word/2010/wordprocessingCanvas" xmlns:cx="http://schemas.microsoft.com/office/drawing/2014/chartex" xmlns:cx1="http://schemas.microsoft.com/office/drawing/2015/9/8/chartex" xmlns:cx2="http://schemas.microsoft.com/office/drawing/2015/10/21/chartex" xmlns:cx3="http://schemas.microsoft.com/office/drawing/2016/5/9/chartex" xmlns:cx4="http://schemas.microsoft.com/office/drawing/2016/5/10/chartex" xmlns:cx5="http://schemas.microsoft.com/office/drawing/2016/5/11/chartex" xmlns:cx6="http://schemas.microsoft.com/office/drawing/2016/5/12/chartex" xmlns:cx7="http://schemas.microsoft.com/office/drawing/2016/5/13/chartex" xmlns:cx8="http://schemas.microsoft.com/office/drawing/2016/5/14/chartex" xmlns:mc="http://schemas.openxmlformats.org/markup-compatibility/2006" xmlns:aink="http://schemas.microsoft.com/office/drawing/2016/ink" xmlns:am3d="http://schemas.microsoft.com/office/drawing/2017/model3d" xmlns:o="urn:schemas-microsoft-com:office:office" xmlns:oel="http://schemas.microsoft.com/office/2019/extlst" xmlns:r="http://schemas.openxmlformats.org/officeDocument/2006/relationships" xmlns:m="http://schemas.openxmlformats.org/officeDocument/2006/math" xmlns:v="urn:schemas-microsoft-com:vml" xmlns:wp14="http://schemas.microsoft.com/office/word/2010/wordprocessingDrawing" xmlns:wp="http://schemas.openxmlformats.org/drawingml/2006/wordprocessingDrawing" xmlns:w10="urn:schemas-microsoft-com:office:word" xmlns:w="http://schemas.openxmlformats.org/wordprocessingml/2006/main" xmlns:w14="http://schemas.microsoft.com/office/word/2010/wordml" xmlns:w15="http://schemas.microsoft.com/office/word/2012/wordml" xmlns:w16cex="http://schemas.microsoft.com/office/word/2018/wordml/cex" xmlns:w16cid="http://schemas.microsoft.com/office/word/2016/wordml/cid" xmlns:w16="http://schemas.microsoft.com/office/word/2018/wordml" xmlns:w16du="http://schemas.microsoft.com/office/word/2023/wordml/word16du" xmlns:w16sdtdh="http://schemas.microsoft.com/office/word/2020/wordml/sdtdatahash" xmlns:w16sdtfl="http://schemas.microsoft.com/office/word/2024/wordml/sdtformatlock" xmlns:w16se="http://schemas.microsoft.com/office/word/2015/wordml/symex" xmlns:wpg="http://schemas.microsoft.com/office/word/2010/wordprocessingGroup" xmlns:wpi="http://schemas.microsoft.com/office/word/2010/wordprocessingInk" xmlns:wne="http://schemas.microsoft.com/office/word/2006/wordml" xmlns:wps="http://schemas.microsoft.com/office/word/2010/wordprocessingShape" mc:Ignorable="w14 w15 w16se w16cid w16 w16cex w16sdtdh w16sdtfl w16du wp14">
+<w:document xmlns:wpc="http://schemas.microsoft.com/office/word/2010/wordprocessingCanvas" xmlns:cx="http://schemas.microsoft.com/office/drawing/2014/chartex" xmlns:cx1="http://schemas.microsoft.com/office/drawing/2015/9/8/chartex" xmlns:cx2="http://schemas.microsoft.com/office/drawing/2015/10/21/chartex" xmlns:cx3="http://schemas.microsoft.com/office/drawing/2016/5/9/chartex" xmlns:cx4="http://schemas.microsoft.com/office/drawing/2016/5/10/chartex" xmlns:cx5="http://schemas.microsoft.com/office/drawing/2016/5/11/chartex" xmlns:cx6="http://schemas.microsoft.com/office/drawing/2016/5/12/chartex" xmlns:cx7="http://schemas.microsoft.com/office/drawing/2016/5/13/chartex" xmlns:cx8="http://schemas.microsoft.com/office/drawing/2016/5/14/chartex" xmlns:mc="http://schemas.openxmlformats.org/markup-compatibility/2006" xmlns:aink="http://schemas.microsoft.com/office/drawing/2016/ink" xmlns:am3d="http://schemas.microsoft.com/office/drawing/2017/model3d" xmlns:o="urn:schemas-microsoft-com:office:office" xmlns:r="http://schemas.openxmlformats.org/officeDocument/2006/relationships" xmlns:m="http://schemas.openxmlformats.org/officeDocument/2006/math" xmlns:v="urn:schemas-microsoft-com:vml" xmlns:wp14="http://schemas.microsoft.com/office/word/2010/wordprocessingDrawing" xmlns:wp="http://schemas.openxmlformats.org/drawingml/2006/wordprocessingDrawing" xmlns:w10="urn:schemas-microsoft-com:office:word" xmlns:w="http://schemas.openxmlformats.org/wordprocessingml/2006/main" xmlns:w14="http://schemas.microsoft.com/office/word/2010/wordml" xmlns:w15="http://schemas.microsoft.com/office/word/2012/wordml" xmlns:w16cid="http://schemas.microsoft.com/office/word/2016/wordml/cid" xmlns:w16se="http://schemas.microsoft.com/office/word/2015/wordml/symex" xmlns:wpg="http://schemas.microsoft.com/office/word/2010/wordprocessingGroup" xmlns:wpi="http://schemas.microsoft.com/office/word/2010/wordprocessingInk" xmlns:wne="http://schemas.microsoft.com/office/word/2006/wordml" xmlns:wps="http://schemas.microsoft.com/office/word/2010/wordprocessingShape" mc:Ignorable="w14 w15 w16se w16cid wp14">
   <w:body>
     <w:p>
       <w:pPr>
@@ -143,8 +143,13 @@
       </w:r>
       <w:proofErr w:type="spellEnd"/>
       <w:r>
-        <w:t xml:space="preserve"> Laura Achetta</w:t>
-      </w:r>
+        <w:t xml:space="preserve"> Laura </w:t>
+      </w:r>
+      <w:proofErr w:type="spellStart"/>
+      <w:r>
+        <w:t>Achetta</w:t>
+      </w:r>
+      <w:proofErr w:type="spellEnd"/>
     </w:p>
     <w:p>
       <w:pPr>
@@ -404,6 +409,7 @@
           <w:docPartUnique/>
         </w:docPartObj>
       </w:sdtPr>
+      <w:sdtEndPr/>
       <w:sdtContent>
         <w:p>
           <w:pPr>
@@ -629,7 +635,10 @@
         <w:spacing w:line="360" w:lineRule="auto"/>
       </w:pPr>
       <w:r>
-        <w:t>Coloca un nombre a tu grupo, breve presentación y crea un logotipo.</w:t>
+        <w:t>Coloca un nombre a tu grupo, breve presenta</w:t>
+      </w:r>
+      <w:r>
+        <w:t>ción y crea un logotipo.</w:t>
       </w:r>
     </w:p>
     <w:p>
@@ -668,7 +677,10 @@
         <w:spacing w:after="40" w:line="360" w:lineRule="auto"/>
       </w:pPr>
       <w:r>
-        <w:t>Anexo: coloca imágenes de las páginas, links consultados para la elicitación, comenta qué relevantes en cada caso.</w:t>
+        <w:t>Anexo: coloca imágenes de las páginas, links consultados para la elici</w:t>
+      </w:r>
+      <w:r>
+        <w:t>tación, comenta qué relevantes en cada caso.</w:t>
       </w:r>
     </w:p>
     <w:p>
@@ -676,9 +688,13 @@
         <w:pStyle w:val="Ttulo1"/>
         <w:shd w:val="clear" w:color="auto" w:fill="FFFFFF"/>
         <w:spacing w:after="0"/>
-      </w:pPr>
-      <w:r>
-        <w:rPr>
+        <w:rPr>
+          <w:b/>
+        </w:rPr>
+      </w:pPr>
+      <w:r>
+        <w:rPr>
+          <w:b/>
           <w:noProof/>
           <w:bdr w:val="none" w:sz="0" w:space="0" w:color="auto" w:frame="1"/>
         </w:rPr>
@@ -747,6 +763,7 @@
       </w:r>
       <w:r>
         <w:rPr>
+          <w:b/>
           <w:color w:val="000000"/>
           <w:sz w:val="24"/>
           <w:szCs w:val="24"/>
@@ -802,6 +819,142 @@
           <w:szCs w:val="22"/>
         </w:rPr>
         <w:t>Creemos que la tecnología debe ser accesible, práctica y fácil de utilizar. Por eso trabajamos en el desarrollo de aplicaciones que permitan resolver necesidades reales de manera simple y eficiente, ayudando a las personas a gestionar mejor sus actividades y tomar decisiones con mayor facilidad.</w:t>
+      </w:r>
+    </w:p>
+    <w:p>
+      <w:pPr>
+        <w:pStyle w:val="Ttulo1"/>
+        <w:spacing w:before="200" w:after="200"/>
+        <w:jc w:val="both"/>
+        <w:rPr>
+          <w:b/>
+        </w:rPr>
+      </w:pPr>
+      <w:bookmarkStart w:id="2" w:name="_GoBack"/>
+      <w:r>
+        <w:rPr>
+          <w:b/>
+          <w:color w:val="000000"/>
+          <w:sz w:val="24"/>
+          <w:szCs w:val="24"/>
+          <w:u w:val="single"/>
+        </w:rPr>
+        <w:t>Enunciado del caso de estudio </w:t>
+      </w:r>
+    </w:p>
+    <w:bookmarkEnd w:id="2"/>
+    <w:p>
+      <w:pPr>
+        <w:pStyle w:val="NormalWeb"/>
+        <w:spacing w:before="200" w:beforeAutospacing="0" w:after="200" w:afterAutospacing="0"/>
+        <w:jc w:val="both"/>
+      </w:pPr>
+      <w:r>
+        <w:rPr>
+          <w:rFonts w:ascii="Arial" w:hAnsi="Arial" w:cs="Arial"/>
+          <w:color w:val="000000"/>
+          <w:sz w:val="22"/>
+          <w:szCs w:val="22"/>
+        </w:rPr>
+        <w:t>Se necesita un software para las personas interesadas en participar en retiros holísticos. </w:t>
+      </w:r>
+    </w:p>
+    <w:p>
+      <w:pPr>
+        <w:pStyle w:val="NormalWeb"/>
+        <w:spacing w:before="200" w:beforeAutospacing="0" w:after="200" w:afterAutospacing="0"/>
+        <w:jc w:val="both"/>
+      </w:pPr>
+      <w:r>
+        <w:rPr>
+          <w:rFonts w:ascii="Arial" w:hAnsi="Arial" w:cs="Arial"/>
+          <w:color w:val="000000"/>
+          <w:sz w:val="22"/>
+          <w:szCs w:val="22"/>
+        </w:rPr>
+        <w:t xml:space="preserve">Actualmente la gran problemática es que toda la información se organiza en planillas de </w:t>
+      </w:r>
+      <w:proofErr w:type="spellStart"/>
+      <w:r>
+        <w:rPr>
+          <w:rFonts w:ascii="Arial" w:hAnsi="Arial" w:cs="Arial"/>
+          <w:color w:val="000000"/>
+          <w:sz w:val="22"/>
+          <w:szCs w:val="22"/>
+        </w:rPr>
+        <w:t>excel</w:t>
+      </w:r>
+      <w:proofErr w:type="spellEnd"/>
+      <w:r>
+        <w:rPr>
+          <w:rFonts w:ascii="Arial" w:hAnsi="Arial" w:cs="Arial"/>
+          <w:color w:val="000000"/>
+          <w:sz w:val="22"/>
+          <w:szCs w:val="22"/>
+        </w:rPr>
+        <w:t xml:space="preserve"> o en papel lo que dificulta en algunos casos la organización, decisión, recordatorios. Dentro de estas planillas se registran datos como ubicación, precio, fecha de inicio y finalización, estado, temática principal (agregar temáticas), cronograma, datos de contacto del coordinador y observaciones personales. </w:t>
+      </w:r>
+    </w:p>
+    <w:p>
+      <w:pPr>
+        <w:pStyle w:val="NormalWeb"/>
+        <w:spacing w:before="200" w:beforeAutospacing="0" w:after="200" w:afterAutospacing="0"/>
+        <w:jc w:val="both"/>
+      </w:pPr>
+      <w:r>
+        <w:rPr>
+          <w:rFonts w:ascii="Arial" w:hAnsi="Arial" w:cs="Arial"/>
+          <w:color w:val="000000"/>
+          <w:sz w:val="22"/>
+          <w:szCs w:val="22"/>
+        </w:rPr>
+        <w:t xml:space="preserve">Por este motivo se necesita un software capaz de centralizar y organizar toda la información relacionada con el tema. </w:t>
+      </w:r>
+      <w:proofErr w:type="gramStart"/>
+      <w:r>
+        <w:rPr>
+          <w:rFonts w:ascii="Arial" w:hAnsi="Arial" w:cs="Arial"/>
+          <w:color w:val="000000"/>
+          <w:sz w:val="22"/>
+          <w:szCs w:val="22"/>
+        </w:rPr>
+        <w:t>Además</w:t>
+      </w:r>
+      <w:proofErr w:type="gramEnd"/>
+      <w:r>
+        <w:rPr>
+          <w:rFonts w:ascii="Arial" w:hAnsi="Arial" w:cs="Arial"/>
+          <w:color w:val="000000"/>
+          <w:sz w:val="22"/>
+          <w:szCs w:val="22"/>
+        </w:rPr>
+        <w:t xml:space="preserve"> debe permitir registrar retiros, clasificarla según actividades, ubicación, estado (pagado, interesado, reservado realizado), rango de fecha, costo. </w:t>
+      </w:r>
+    </w:p>
+    <w:p>
+      <w:pPr>
+        <w:pStyle w:val="NormalWeb"/>
+        <w:spacing w:before="200" w:beforeAutospacing="0" w:after="200" w:afterAutospacing="0"/>
+        <w:jc w:val="both"/>
+      </w:pPr>
+      <w:r>
+        <w:rPr>
+          <w:rFonts w:ascii="Arial" w:hAnsi="Arial" w:cs="Arial"/>
+          <w:color w:val="000000"/>
+          <w:sz w:val="22"/>
+          <w:szCs w:val="22"/>
+        </w:rPr>
+        <w:t xml:space="preserve">Asimismo, el sistema deberá permitir planificar pagos asociados a los retiros, registrar acompañantes, almacenar comentarios sobre las experiencias vividas, realizar valoraciones personales y mantener un historial de los retiros realizados. También deberá facilitar la </w:t>
+      </w:r>
+      <w:r>
+        <w:rPr>
+          <w:rFonts w:ascii="Arial" w:hAnsi="Arial" w:cs="Arial"/>
+          <w:color w:val="000000"/>
+          <w:sz w:val="22"/>
+          <w:szCs w:val="22"/>
+        </w:rPr>
+        <w:lastRenderedPageBreak/>
+        <w:t>búsqueda y aplicación de filtros para encontrar rápidamente la información deseada, compartir datos de un retiro con otros usuarios interesados y generar alertas cuando se acerquen las fechas de pago, reserva o inicio de un retiro. </w:t>
       </w:r>
     </w:p>
     <w:p>
@@ -824,7 +977,7 @@
 </file>
 
 <file path=word/endnotes.xml><?xml version="1.0" encoding="utf-8"?>
-<w:endnotes xmlns:wpc="http://schemas.microsoft.com/office/word/2010/wordprocessingCanvas" xmlns:cx="http://schemas.microsoft.com/office/drawing/2014/chartex" xmlns:cx1="http://schemas.microsoft.com/office/drawing/2015/9/8/chartex" xmlns:cx2="http://schemas.microsoft.com/office/drawing/2015/10/21/chartex" xmlns:cx3="http://schemas.microsoft.com/office/drawing/2016/5/9/chartex" xmlns:cx4="http://schemas.microsoft.com/office/drawing/2016/5/10/chartex" xmlns:cx5="http://schemas.microsoft.com/office/drawing/2016/5/11/chartex" xmlns:cx6="http://schemas.microsoft.com/office/drawing/2016/5/12/chartex" xmlns:cx7="http://schemas.microsoft.com/office/drawing/2016/5/13/chartex" xmlns:cx8="http://schemas.microsoft.com/office/drawing/2016/5/14/chartex" xmlns:mc="http://schemas.openxmlformats.org/markup-compatibility/2006" xmlns:aink="http://schemas.microsoft.com/office/drawing/2016/ink" xmlns:am3d="http://schemas.microsoft.com/office/drawing/2017/model3d" xmlns:o="urn:schemas-microsoft-com:office:office" xmlns:oel="http://schemas.microsoft.com/office/2019/extlst" xmlns:r="http://schemas.openxmlformats.org/officeDocument/2006/relationships" xmlns:m="http://schemas.openxmlformats.org/officeDocument/2006/math" xmlns:v="urn:schemas-microsoft-com:vml" xmlns:wp14="http://schemas.microsoft.com/office/word/2010/wordprocessingDrawing" xmlns:wp="http://schemas.openxmlformats.org/drawingml/2006/wordprocessingDrawing" xmlns:w10="urn:schemas-microsoft-com:office:word" xmlns:w="http://schemas.openxmlformats.org/wordprocessingml/2006/main" xmlns:w14="http://schemas.microsoft.com/office/word/2010/wordml" xmlns:w15="http://schemas.microsoft.com/office/word/2012/wordml" xmlns:w16cex="http://schemas.microsoft.com/office/word/2018/wordml/cex" xmlns:w16cid="http://schemas.microsoft.com/office/word/2016/wordml/cid" xmlns:w16="http://schemas.microsoft.com/office/word/2018/wordml" xmlns:w16du="http://schemas.microsoft.com/office/word/2023/wordml/word16du" xmlns:w16sdtdh="http://schemas.microsoft.com/office/word/2020/wordml/sdtdatahash" xmlns:w16sdtfl="http://schemas.microsoft.com/office/word/2024/wordml/sdtformatlock" xmlns:w16se="http://schemas.microsoft.com/office/word/2015/wordml/symex" xmlns:wpg="http://schemas.microsoft.com/office/word/2010/wordprocessingGroup" xmlns:wpi="http://schemas.microsoft.com/office/word/2010/wordprocessingInk" xmlns:wne="http://schemas.microsoft.com/office/word/2006/wordml" xmlns:wps="http://schemas.microsoft.com/office/word/2010/wordprocessingShape" mc:Ignorable="w14 w15 w16se w16cid w16 w16cex w16sdtdh w16sdtfl w16du wp14">
+<w:endnotes xmlns:wpc="http://schemas.microsoft.com/office/word/2010/wordprocessingCanvas" xmlns:cx="http://schemas.microsoft.com/office/drawing/2014/chartex" xmlns:cx1="http://schemas.microsoft.com/office/drawing/2015/9/8/chartex" xmlns:cx2="http://schemas.microsoft.com/office/drawing/2015/10/21/chartex" xmlns:cx3="http://schemas.microsoft.com/office/drawing/2016/5/9/chartex" xmlns:cx4="http://schemas.microsoft.com/office/drawing/2016/5/10/chartex" xmlns:cx5="http://schemas.microsoft.com/office/drawing/2016/5/11/chartex" xmlns:cx6="http://schemas.microsoft.com/office/drawing/2016/5/12/chartex" xmlns:cx7="http://schemas.microsoft.com/office/drawing/2016/5/13/chartex" xmlns:cx8="http://schemas.microsoft.com/office/drawing/2016/5/14/chartex" xmlns:mc="http://schemas.openxmlformats.org/markup-compatibility/2006" xmlns:aink="http://schemas.microsoft.com/office/drawing/2016/ink" xmlns:am3d="http://schemas.microsoft.com/office/drawing/2017/model3d" xmlns:o="urn:schemas-microsoft-com:office:office" xmlns:r="http://schemas.openxmlformats.org/officeDocument/2006/relationships" xmlns:m="http://schemas.openxmlformats.org/officeDocument/2006/math" xmlns:v="urn:schemas-microsoft-com:vml" xmlns:wp14="http://schemas.microsoft.com/office/word/2010/wordprocessingDrawing" xmlns:wp="http://schemas.openxmlformats.org/drawingml/2006/wordprocessingDrawing" xmlns:w10="urn:schemas-microsoft-com:office:word" xmlns:w="http://schemas.openxmlformats.org/wordprocessingml/2006/main" xmlns:w14="http://schemas.microsoft.com/office/word/2010/wordml" xmlns:w15="http://schemas.microsoft.com/office/word/2012/wordml" xmlns:w16cid="http://schemas.microsoft.com/office/word/2016/wordml/cid" xmlns:w16se="http://schemas.microsoft.com/office/word/2015/wordml/symex" xmlns:wpg="http://schemas.microsoft.com/office/word/2010/wordprocessingGroup" xmlns:wpi="http://schemas.microsoft.com/office/word/2010/wordprocessingInk" xmlns:wne="http://schemas.microsoft.com/office/word/2006/wordml" xmlns:wps="http://schemas.microsoft.com/office/word/2010/wordprocessingShape" mc:Ignorable="w14 w15 w16se w16cid wp14">
   <w:endnote w:type="separator" w:id="-1">
     <w:p>
       <w:pPr>
@@ -849,13 +1002,13 @@
 </file>
 
 <file path=word/footer1.xml><?xml version="1.0" encoding="utf-8"?>
-<w:ftr xmlns:wpc="http://schemas.microsoft.com/office/word/2010/wordprocessingCanvas" xmlns:cx="http://schemas.microsoft.com/office/drawing/2014/chartex" xmlns:cx1="http://schemas.microsoft.com/office/drawing/2015/9/8/chartex" xmlns:cx2="http://schemas.microsoft.com/office/drawing/2015/10/21/chartex" xmlns:cx3="http://schemas.microsoft.com/office/drawing/2016/5/9/chartex" xmlns:cx4="http://schemas.microsoft.com/office/drawing/2016/5/10/chartex" xmlns:cx5="http://schemas.microsoft.com/office/drawing/2016/5/11/chartex" xmlns:cx6="http://schemas.microsoft.com/office/drawing/2016/5/12/chartex" xmlns:cx7="http://schemas.microsoft.com/office/drawing/2016/5/13/chartex" xmlns:cx8="http://schemas.microsoft.com/office/drawing/2016/5/14/chartex" xmlns:mc="http://schemas.openxmlformats.org/markup-compatibility/2006" xmlns:aink="http://schemas.microsoft.com/office/drawing/2016/ink" xmlns:am3d="http://schemas.microsoft.com/office/drawing/2017/model3d" xmlns:o="urn:schemas-microsoft-com:office:office" xmlns:oel="http://schemas.microsoft.com/office/2019/extlst" xmlns:r="http://schemas.openxmlformats.org/officeDocument/2006/relationships" xmlns:m="http://schemas.openxmlformats.org/officeDocument/2006/math" xmlns:v="urn:schemas-microsoft-com:vml" xmlns:wp14="http://schemas.microsoft.com/office/word/2010/wordprocessingDrawing" xmlns:wp="http://schemas.openxmlformats.org/drawingml/2006/wordprocessingDrawing" xmlns:w10="urn:schemas-microsoft-com:office:word" xmlns:w="http://schemas.openxmlformats.org/wordprocessingml/2006/main" xmlns:w14="http://schemas.microsoft.com/office/word/2010/wordml" xmlns:w15="http://schemas.microsoft.com/office/word/2012/wordml" xmlns:w16cex="http://schemas.microsoft.com/office/word/2018/wordml/cex" xmlns:w16cid="http://schemas.microsoft.com/office/word/2016/wordml/cid" xmlns:w16="http://schemas.microsoft.com/office/word/2018/wordml" xmlns:w16du="http://schemas.microsoft.com/office/word/2023/wordml/word16du" xmlns:w16sdtdh="http://schemas.microsoft.com/office/word/2020/wordml/sdtdatahash" xmlns:w16sdtfl="http://schemas.microsoft.com/office/word/2024/wordml/sdtformatlock" xmlns:w16se="http://schemas.microsoft.com/office/word/2015/wordml/symex" xmlns:wpg="http://schemas.microsoft.com/office/word/2010/wordprocessingGroup" xmlns:wpi="http://schemas.microsoft.com/office/word/2010/wordprocessingInk" xmlns:wne="http://schemas.microsoft.com/office/word/2006/wordml" xmlns:wps="http://schemas.microsoft.com/office/word/2010/wordprocessingShape" mc:Ignorable="w14 w15 w16se w16cid w16 w16cex w16sdtdh w16sdtfl w16du wp14">
+<w:ftr xmlns:wpc="http://schemas.microsoft.com/office/word/2010/wordprocessingCanvas" xmlns:cx="http://schemas.microsoft.com/office/drawing/2014/chartex" xmlns:cx1="http://schemas.microsoft.com/office/drawing/2015/9/8/chartex" xmlns:cx2="http://schemas.microsoft.com/office/drawing/2015/10/21/chartex" xmlns:cx3="http://schemas.microsoft.com/office/drawing/2016/5/9/chartex" xmlns:cx4="http://schemas.microsoft.com/office/drawing/2016/5/10/chartex" xmlns:cx5="http://schemas.microsoft.com/office/drawing/2016/5/11/chartex" xmlns:cx6="http://schemas.microsoft.com/office/drawing/2016/5/12/chartex" xmlns:cx7="http://schemas.microsoft.com/office/drawing/2016/5/13/chartex" xmlns:cx8="http://schemas.microsoft.com/office/drawing/2016/5/14/chartex" xmlns:mc="http://schemas.openxmlformats.org/markup-compatibility/2006" xmlns:aink="http://schemas.microsoft.com/office/drawing/2016/ink" xmlns:am3d="http://schemas.microsoft.com/office/drawing/2017/model3d" xmlns:o="urn:schemas-microsoft-com:office:office" xmlns:r="http://schemas.openxmlformats.org/officeDocument/2006/relationships" xmlns:m="http://schemas.openxmlformats.org/officeDocument/2006/math" xmlns:v="urn:schemas-microsoft-com:vml" xmlns:wp14="http://schemas.microsoft.com/office/word/2010/wordprocessingDrawing" xmlns:wp="http://schemas.openxmlformats.org/drawingml/2006/wordprocessingDrawing" xmlns:w10="urn:schemas-microsoft-com:office:word" xmlns:w="http://schemas.openxmlformats.org/wordprocessingml/2006/main" xmlns:w14="http://schemas.microsoft.com/office/word/2010/wordml" xmlns:w15="http://schemas.microsoft.com/office/word/2012/wordml" xmlns:w16cid="http://schemas.microsoft.com/office/word/2016/wordml/cid" xmlns:w16se="http://schemas.microsoft.com/office/word/2015/wordml/symex" xmlns:wpg="http://schemas.microsoft.com/office/word/2010/wordprocessingGroup" xmlns:wpi="http://schemas.microsoft.com/office/word/2010/wordprocessingInk" xmlns:wne="http://schemas.microsoft.com/office/word/2006/wordml" xmlns:wps="http://schemas.microsoft.com/office/word/2010/wordprocessingShape" mc:Ignorable="w14 w15 w16se w16cid wp14">
   <w:p/>
 </w:ftr>
 </file>
 
 <file path=word/footnotes.xml><?xml version="1.0" encoding="utf-8"?>
-<w:footnotes xmlns:wpc="http://schemas.microsoft.com/office/word/2010/wordprocessingCanvas" xmlns:cx="http://schemas.microsoft.com/office/drawing/2014/chartex" xmlns:cx1="http://schemas.microsoft.com/office/drawing/2015/9/8/chartex" xmlns:cx2="http://schemas.microsoft.com/office/drawing/2015/10/21/chartex" xmlns:cx3="http://schemas.microsoft.com/office/drawing/2016/5/9/chartex" xmlns:cx4="http://schemas.microsoft.com/office/drawing/2016/5/10/chartex" xmlns:cx5="http://schemas.microsoft.com/office/drawing/2016/5/11/chartex" xmlns:cx6="http://schemas.microsoft.com/office/drawing/2016/5/12/chartex" xmlns:cx7="http://schemas.microsoft.com/office/drawing/2016/5/13/chartex" xmlns:cx8="http://schemas.microsoft.com/office/drawing/2016/5/14/chartex" xmlns:mc="http://schemas.openxmlformats.org/markup-compatibility/2006" xmlns:aink="http://schemas.microsoft.com/office/drawing/2016/ink" xmlns:am3d="http://schemas.microsoft.com/office/drawing/2017/model3d" xmlns:o="urn:schemas-microsoft-com:office:office" xmlns:oel="http://schemas.microsoft.com/office/2019/extlst" xmlns:r="http://schemas.openxmlformats.org/officeDocument/2006/relationships" xmlns:m="http://schemas.openxmlformats.org/officeDocument/2006/math" xmlns:v="urn:schemas-microsoft-com:vml" xmlns:wp14="http://schemas.microsoft.com/office/word/2010/wordprocessingDrawing" xmlns:wp="http://schemas.openxmlformats.org/drawingml/2006/wordprocessingDrawing" xmlns:w10="urn:schemas-microsoft-com:office:word" xmlns:w="http://schemas.openxmlformats.org/wordprocessingml/2006/main" xmlns:w14="http://schemas.microsoft.com/office/word/2010/wordml" xmlns:w15="http://schemas.microsoft.com/office/word/2012/wordml" xmlns:w16cex="http://schemas.microsoft.com/office/word/2018/wordml/cex" xmlns:w16cid="http://schemas.microsoft.com/office/word/2016/wordml/cid" xmlns:w16="http://schemas.microsoft.com/office/word/2018/wordml" xmlns:w16du="http://schemas.microsoft.com/office/word/2023/wordml/word16du" xmlns:w16sdtdh="http://schemas.microsoft.com/office/word/2020/wordml/sdtdatahash" xmlns:w16sdtfl="http://schemas.microsoft.com/office/word/2024/wordml/sdtformatlock" xmlns:w16se="http://schemas.microsoft.com/office/word/2015/wordml/symex" xmlns:wpg="http://schemas.microsoft.com/office/word/2010/wordprocessingGroup" xmlns:wpi="http://schemas.microsoft.com/office/word/2010/wordprocessingInk" xmlns:wne="http://schemas.microsoft.com/office/word/2006/wordml" xmlns:wps="http://schemas.microsoft.com/office/word/2010/wordprocessingShape" mc:Ignorable="w14 w15 w16se w16cid w16 w16cex w16sdtdh w16sdtfl w16du wp14">
+<w:footnotes xmlns:wpc="http://schemas.microsoft.com/office/word/2010/wordprocessingCanvas" xmlns:cx="http://schemas.microsoft.com/office/drawing/2014/chartex" xmlns:cx1="http://schemas.microsoft.com/office/drawing/2015/9/8/chartex" xmlns:cx2="http://schemas.microsoft.com/office/drawing/2015/10/21/chartex" xmlns:cx3="http://schemas.microsoft.com/office/drawing/2016/5/9/chartex" xmlns:cx4="http://schemas.microsoft.com/office/drawing/2016/5/10/chartex" xmlns:cx5="http://schemas.microsoft.com/office/drawing/2016/5/11/chartex" xmlns:cx6="http://schemas.microsoft.com/office/drawing/2016/5/12/chartex" xmlns:cx7="http://schemas.microsoft.com/office/drawing/2016/5/13/chartex" xmlns:cx8="http://schemas.microsoft.com/office/drawing/2016/5/14/chartex" xmlns:mc="http://schemas.openxmlformats.org/markup-compatibility/2006" xmlns:aink="http://schemas.microsoft.com/office/drawing/2016/ink" xmlns:am3d="http://schemas.microsoft.com/office/drawing/2017/model3d" xmlns:o="urn:schemas-microsoft-com:office:office" xmlns:r="http://schemas.openxmlformats.org/officeDocument/2006/relationships" xmlns:m="http://schemas.openxmlformats.org/officeDocument/2006/math" xmlns:v="urn:schemas-microsoft-com:vml" xmlns:wp14="http://schemas.microsoft.com/office/word/2010/wordprocessingDrawing" xmlns:wp="http://schemas.openxmlformats.org/drawingml/2006/wordprocessingDrawing" xmlns:w10="urn:schemas-microsoft-com:office:word" xmlns:w="http://schemas.openxmlformats.org/wordprocessingml/2006/main" xmlns:w14="http://schemas.microsoft.com/office/word/2010/wordml" xmlns:w15="http://schemas.microsoft.com/office/word/2012/wordml" xmlns:w16cid="http://schemas.microsoft.com/office/word/2016/wordml/cid" xmlns:w16se="http://schemas.microsoft.com/office/word/2015/wordml/symex" xmlns:wpg="http://schemas.microsoft.com/office/word/2010/wordprocessingGroup" xmlns:wpi="http://schemas.microsoft.com/office/word/2010/wordprocessingInk" xmlns:wne="http://schemas.microsoft.com/office/word/2006/wordml" xmlns:wps="http://schemas.microsoft.com/office/word/2010/wordprocessingShape" mc:Ignorable="w14 w15 w16se w16cid wp14">
   <w:footnote w:type="separator" w:id="-1">
     <w:p>
       <w:pPr>
@@ -880,13 +1033,13 @@
 </file>
 
 <file path=word/header1.xml><?xml version="1.0" encoding="utf-8"?>
-<w:hdr xmlns:wpc="http://schemas.microsoft.com/office/word/2010/wordprocessingCanvas" xmlns:cx="http://schemas.microsoft.com/office/drawing/2014/chartex" xmlns:cx1="http://schemas.microsoft.com/office/drawing/2015/9/8/chartex" xmlns:cx2="http://schemas.microsoft.com/office/drawing/2015/10/21/chartex" xmlns:cx3="http://schemas.microsoft.com/office/drawing/2016/5/9/chartex" xmlns:cx4="http://schemas.microsoft.com/office/drawing/2016/5/10/chartex" xmlns:cx5="http://schemas.microsoft.com/office/drawing/2016/5/11/chartex" xmlns:cx6="http://schemas.microsoft.com/office/drawing/2016/5/12/chartex" xmlns:cx7="http://schemas.microsoft.com/office/drawing/2016/5/13/chartex" xmlns:cx8="http://schemas.microsoft.com/office/drawing/2016/5/14/chartex" xmlns:mc="http://schemas.openxmlformats.org/markup-compatibility/2006" xmlns:aink="http://schemas.microsoft.com/office/drawing/2016/ink" xmlns:am3d="http://schemas.microsoft.com/office/drawing/2017/model3d" xmlns:o="urn:schemas-microsoft-com:office:office" xmlns:oel="http://schemas.microsoft.com/office/2019/extlst" xmlns:r="http://schemas.openxmlformats.org/officeDocument/2006/relationships" xmlns:m="http://schemas.openxmlformats.org/officeDocument/2006/math" xmlns:v="urn:schemas-microsoft-com:vml" xmlns:wp14="http://schemas.microsoft.com/office/word/2010/wordprocessingDrawing" xmlns:wp="http://schemas.openxmlformats.org/drawingml/2006/wordprocessingDrawing" xmlns:w10="urn:schemas-microsoft-com:office:word" xmlns:w="http://schemas.openxmlformats.org/wordprocessingml/2006/main" xmlns:w14="http://schemas.microsoft.com/office/word/2010/wordml" xmlns:w15="http://schemas.microsoft.com/office/word/2012/wordml" xmlns:w16cex="http://schemas.microsoft.com/office/word/2018/wordml/cex" xmlns:w16cid="http://schemas.microsoft.com/office/word/2016/wordml/cid" xmlns:w16="http://schemas.microsoft.com/office/word/2018/wordml" xmlns:w16du="http://schemas.microsoft.com/office/word/2023/wordml/word16du" xmlns:w16sdtdh="http://schemas.microsoft.com/office/word/2020/wordml/sdtdatahash" xmlns:w16sdtfl="http://schemas.microsoft.com/office/word/2024/wordml/sdtformatlock" xmlns:w16se="http://schemas.microsoft.com/office/word/2015/wordml/symex" xmlns:wpg="http://schemas.microsoft.com/office/word/2010/wordprocessingGroup" xmlns:wpi="http://schemas.microsoft.com/office/word/2010/wordprocessingInk" xmlns:wne="http://schemas.microsoft.com/office/word/2006/wordml" xmlns:wps="http://schemas.microsoft.com/office/word/2010/wordprocessingShape" mc:Ignorable="w14 w15 w16se w16cid w16 w16cex w16sdtdh w16sdtfl w16du wp14">
+<w:hdr xmlns:wpc="http://schemas.microsoft.com/office/word/2010/wordprocessingCanvas" xmlns:cx="http://schemas.microsoft.com/office/drawing/2014/chartex" xmlns:cx1="http://schemas.microsoft.com/office/drawing/2015/9/8/chartex" xmlns:cx2="http://schemas.microsoft.com/office/drawing/2015/10/21/chartex" xmlns:cx3="http://schemas.microsoft.com/office/drawing/2016/5/9/chartex" xmlns:cx4="http://schemas.microsoft.com/office/drawing/2016/5/10/chartex" xmlns:cx5="http://schemas.microsoft.com/office/drawing/2016/5/11/chartex" xmlns:cx6="http://schemas.microsoft.com/office/drawing/2016/5/12/chartex" xmlns:cx7="http://schemas.microsoft.com/office/drawing/2016/5/13/chartex" xmlns:cx8="http://schemas.microsoft.com/office/drawing/2016/5/14/chartex" xmlns:mc="http://schemas.openxmlformats.org/markup-compatibility/2006" xmlns:aink="http://schemas.microsoft.com/office/drawing/2016/ink" xmlns:am3d="http://schemas.microsoft.com/office/drawing/2017/model3d" xmlns:o="urn:schemas-microsoft-com:office:office" xmlns:r="http://schemas.openxmlformats.org/officeDocument/2006/relationships" xmlns:m="http://schemas.openxmlformats.org/officeDocument/2006/math" xmlns:v="urn:schemas-microsoft-com:vml" xmlns:wp14="http://schemas.microsoft.com/office/word/2010/wordprocessingDrawing" xmlns:wp="http://schemas.openxmlformats.org/drawingml/2006/wordprocessingDrawing" xmlns:w10="urn:schemas-microsoft-com:office:word" xmlns:w="http://schemas.openxmlformats.org/wordprocessingml/2006/main" xmlns:w14="http://schemas.microsoft.com/office/word/2010/wordml" xmlns:w15="http://schemas.microsoft.com/office/word/2012/wordml" xmlns:w16cid="http://schemas.microsoft.com/office/word/2016/wordml/cid" xmlns:w16se="http://schemas.microsoft.com/office/word/2015/wordml/symex" xmlns:wpg="http://schemas.microsoft.com/office/word/2010/wordprocessingGroup" xmlns:wpi="http://schemas.microsoft.com/office/word/2010/wordprocessingInk" xmlns:wne="http://schemas.microsoft.com/office/word/2006/wordml" xmlns:wps="http://schemas.microsoft.com/office/word/2010/wordprocessingShape" mc:Ignorable="w14 w15 w16se w16cid wp14">
   <w:p/>
 </w:hdr>
 </file>
 
 <file path=word/numbering.xml><?xml version="1.0" encoding="utf-8"?>
-<w:numbering xmlns:wpc="http://schemas.microsoft.com/office/word/2010/wordprocessingCanvas" xmlns:cx="http://schemas.microsoft.com/office/drawing/2014/chartex" xmlns:cx1="http://schemas.microsoft.com/office/drawing/2015/9/8/chartex" xmlns:cx2="http://schemas.microsoft.com/office/drawing/2015/10/21/chartex" xmlns:cx3="http://schemas.microsoft.com/office/drawing/2016/5/9/chartex" xmlns:cx4="http://schemas.microsoft.com/office/drawing/2016/5/10/chartex" xmlns:cx5="http://schemas.microsoft.com/office/drawing/2016/5/11/chartex" xmlns:cx6="http://schemas.microsoft.com/office/drawing/2016/5/12/chartex" xmlns:cx7="http://schemas.microsoft.com/office/drawing/2016/5/13/chartex" xmlns:cx8="http://schemas.microsoft.com/office/drawing/2016/5/14/chartex" xmlns:mc="http://schemas.openxmlformats.org/markup-compatibility/2006" xmlns:aink="http://schemas.microsoft.com/office/drawing/2016/ink" xmlns:am3d="http://schemas.microsoft.com/office/drawing/2017/model3d" xmlns:o="urn:schemas-microsoft-com:office:office" xmlns:oel="http://schemas.microsoft.com/office/2019/extlst" xmlns:r="http://schemas.openxmlformats.org/officeDocument/2006/relationships" xmlns:m="http://schemas.openxmlformats.org/officeDocument/2006/math" xmlns:v="urn:schemas-microsoft-com:vml" xmlns:wp14="http://schemas.microsoft.com/office/word/2010/wordprocessingDrawing" xmlns:wp="http://schemas.openxmlformats.org/drawingml/2006/wordprocessingDrawing" xmlns:w10="urn:schemas-microsoft-com:office:word" xmlns:w="http://schemas.openxmlformats.org/wordprocessingml/2006/main" xmlns:w14="http://schemas.microsoft.com/office/word/2010/wordml" xmlns:w15="http://schemas.microsoft.com/office/word/2012/wordml" xmlns:w16cex="http://schemas.microsoft.com/office/word/2018/wordml/cex" xmlns:w16cid="http://schemas.microsoft.com/office/word/2016/wordml/cid" xmlns:w16="http://schemas.microsoft.com/office/word/2018/wordml" xmlns:w16du="http://schemas.microsoft.com/office/word/2023/wordml/word16du" xmlns:w16sdtdh="http://schemas.microsoft.com/office/word/2020/wordml/sdtdatahash" xmlns:w16sdtfl="http://schemas.microsoft.com/office/word/2024/wordml/sdtformatlock" xmlns:w16se="http://schemas.microsoft.com/office/word/2015/wordml/symex" xmlns:wpg="http://schemas.microsoft.com/office/word/2010/wordprocessingGroup" xmlns:wpi="http://schemas.microsoft.com/office/word/2010/wordprocessingInk" xmlns:wne="http://schemas.microsoft.com/office/word/2006/wordml" xmlns:wps="http://schemas.microsoft.com/office/word/2010/wordprocessingShape" mc:Ignorable="w14 w15 w16se w16cid w16 w16cex w16sdtdh w16sdtfl w16du wp14">
+<w:numbering xmlns:wpc="http://schemas.microsoft.com/office/word/2010/wordprocessingCanvas" xmlns:cx="http://schemas.microsoft.com/office/drawing/2014/chartex" xmlns:cx1="http://schemas.microsoft.com/office/drawing/2015/9/8/chartex" xmlns:cx2="http://schemas.microsoft.com/office/drawing/2015/10/21/chartex" xmlns:cx3="http://schemas.microsoft.com/office/drawing/2016/5/9/chartex" xmlns:cx4="http://schemas.microsoft.com/office/drawing/2016/5/10/chartex" xmlns:cx5="http://schemas.microsoft.com/office/drawing/2016/5/11/chartex" xmlns:cx6="http://schemas.microsoft.com/office/drawing/2016/5/12/chartex" xmlns:cx7="http://schemas.microsoft.com/office/drawing/2016/5/13/chartex" xmlns:cx8="http://schemas.microsoft.com/office/drawing/2016/5/14/chartex" xmlns:mc="http://schemas.openxmlformats.org/markup-compatibility/2006" xmlns:aink="http://schemas.microsoft.com/office/drawing/2016/ink" xmlns:am3d="http://schemas.microsoft.com/office/drawing/2017/model3d" xmlns:o="urn:schemas-microsoft-com:office:office" xmlns:r="http://schemas.openxmlformats.org/officeDocument/2006/relationships" xmlns:m="http://schemas.openxmlformats.org/officeDocument/2006/math" xmlns:v="urn:schemas-microsoft-com:vml" xmlns:wp14="http://schemas.microsoft.com/office/word/2010/wordprocessingDrawing" xmlns:wp="http://schemas.openxmlformats.org/drawingml/2006/wordprocessingDrawing" xmlns:w10="urn:schemas-microsoft-com:office:word" xmlns:w="http://schemas.openxmlformats.org/wordprocessingml/2006/main" xmlns:w14="http://schemas.microsoft.com/office/word/2010/wordml" xmlns:w15="http://schemas.microsoft.com/office/word/2012/wordml" xmlns:w16cid="http://schemas.microsoft.com/office/word/2016/wordml/cid" xmlns:w16se="http://schemas.microsoft.com/office/word/2015/wordml/symex" xmlns:wpg="http://schemas.microsoft.com/office/word/2010/wordprocessingGroup" xmlns:wpi="http://schemas.microsoft.com/office/word/2010/wordprocessingInk" xmlns:wne="http://schemas.microsoft.com/office/word/2006/wordml" xmlns:wps="http://schemas.microsoft.com/office/word/2010/wordprocessingShape" mc:Ignorable="w14 w15 w16se w16cid wp14">
   <w:abstractNum w:abstractNumId="0" w15:restartNumberingAfterBreak="0">
     <w:nsid w:val="045D123A"/>
     <w:multiLevelType w:val="multilevel"/>
@@ -1226,20 +1379,20 @@
       </w:rPr>
     </w:lvl>
   </w:abstractNum>
-  <w:num w:numId="1" w16cid:durableId="2080013566">
+  <w:num w:numId="1">
     <w:abstractNumId w:val="2"/>
   </w:num>
-  <w:num w:numId="2" w16cid:durableId="1741515637">
+  <w:num w:numId="2">
     <w:abstractNumId w:val="0"/>
   </w:num>
-  <w:num w:numId="3" w16cid:durableId="1730181079">
+  <w:num w:numId="3">
     <w:abstractNumId w:val="1"/>
   </w:num>
 </w:numbering>
 </file>
 
 <file path=word/styles.xml><?xml version="1.0" encoding="utf-8"?>
-<w:styles xmlns:mc="http://schemas.openxmlformats.org/markup-compatibility/2006" xmlns:r="http://schemas.openxmlformats.org/officeDocument/2006/relationships" xmlns:w="http://schemas.openxmlformats.org/wordprocessingml/2006/main" xmlns:w14="http://schemas.microsoft.com/office/word/2010/wordml" xmlns:w15="http://schemas.microsoft.com/office/word/2012/wordml" xmlns:w16cex="http://schemas.microsoft.com/office/word/2018/wordml/cex" xmlns:w16cid="http://schemas.microsoft.com/office/word/2016/wordml/cid" xmlns:w16="http://schemas.microsoft.com/office/word/2018/wordml" xmlns:w16du="http://schemas.microsoft.com/office/word/2023/wordml/word16du" xmlns:w16sdtdh="http://schemas.microsoft.com/office/word/2020/wordml/sdtdatahash" xmlns:w16sdtfl="http://schemas.microsoft.com/office/word/2024/wordml/sdtformatlock" xmlns:w16se="http://schemas.microsoft.com/office/word/2015/wordml/symex" mc:Ignorable="w14 w15 w16se w16cid w16 w16cex w16sdtdh w16sdtfl w16du">
+<w:styles xmlns:mc="http://schemas.openxmlformats.org/markup-compatibility/2006" xmlns:r="http://schemas.openxmlformats.org/officeDocument/2006/relationships" xmlns:w="http://schemas.openxmlformats.org/wordprocessingml/2006/main" xmlns:w14="http://schemas.microsoft.com/office/word/2010/wordml" xmlns:w15="http://schemas.microsoft.com/office/word/2012/wordml" xmlns:w16cid="http://schemas.microsoft.com/office/word/2016/wordml/cid" xmlns:w16se="http://schemas.microsoft.com/office/word/2015/wordml/symex" mc:Ignorable="w14 w15 w16se w16cid">
   <w:docDefaults>
     <w:rPrDefault>
       <w:rPr>
@@ -1255,7 +1408,7 @@
       </w:pPr>
     </w:pPrDefault>
   </w:docDefaults>
-  <w:latentStyles w:defLockedState="0" w:defUIPriority="99" w:defSemiHidden="0" w:defUnhideWhenUsed="0" w:defQFormat="0" w:count="376">
+  <w:latentStyles w:defLockedState="0" w:defUIPriority="99" w:defSemiHidden="0" w:defUnhideWhenUsed="0" w:defQFormat="0" w:count="375">
     <w:lsdException w:name="Normal" w:uiPriority="0" w:qFormat="1"/>
     <w:lsdException w:name="heading 1" w:uiPriority="9" w:qFormat="1"/>
     <w:lsdException w:name="heading 2" w:semiHidden="1" w:uiPriority="9" w:unhideWhenUsed="1" w:qFormat="1"/>
@@ -1631,7 +1784,6 @@
     <w:lsdException w:name="Smart Hyperlink" w:semiHidden="1" w:unhideWhenUsed="1"/>
     <w:lsdException w:name="Hashtag" w:semiHidden="1" w:unhideWhenUsed="1"/>
     <w:lsdException w:name="Unresolved Mention" w:semiHidden="1" w:unhideWhenUsed="1"/>
-    <w:lsdException w:name="Smart Link" w:semiHidden="1" w:unhideWhenUsed="1"/>
   </w:latentStyles>
   <w:style w:type="paragraph" w:default="1" w:styleId="Normal">
     <w:name w:val="Normal"/>

</xml_diff>